<commit_message>
Expand manuscript to 35 source-linked references
</commit_message>
<xml_diff>
--- a/manuscript/Data_Descriptor.docx
+++ b/manuscript/Data_Descriptor.docx
@@ -212,7 +212,7 @@
         <w:widowControl/>
       </w:pPr>
       <w:r>
-        <w:t>Public documentation of AI-enabled medical devices provides information about the data a function consumes, the result it produces, and its intended clinical use. The US Food and Drug Administration (FDA) list provides submission identifiers through which these descriptions can be linked across regulatory documents.</w:t>
+        <w:t>Public regulatory documents describe the clinical functions of artificial intelligence (AI)–enabled medical devices through submission summaries, decision documents, and intended-use statements. The US Food and Drug Administration (FDA) list supplies submission identifiers that link these descriptions across records.</w:t>
       </w:r>
       <w:r>
         <w:rPr>
@@ -221,7 +221,40 @@
         <w:t>1</w:t>
       </w:r>
       <w:r>
-        <w:t xml:space="preserve"> Reuse requires a consistent representation of clinical functions alongside the passages and source versions used to assign each annotation. It also requires distinguishing language about a whole device from language attributable to an AI-related function.</w:t>
+        <w:t xml:space="preserve"> Earlier public databases catalogued AI-enabled devices, while subsequent studies examined the clinical tasks, inputs, outputs, and clinician-facing interfaces described in their documentation.</w:t>
+      </w:r>
+      <w:r>
+        <w:rPr>
+          <w:vertAlign w:val="superscript"/>
+        </w:rPr>
+        <w:t>2,3,4,5</w:t>
+      </w:r>
+      <w:r/>
+    </w:p>
+    <w:p>
+      <w:pPr>
+        <w:widowControl/>
+      </w:pPr>
+      <w:r>
+        <w:t>The choice of source affects what can be extracted. Comparisons of marketing material with FDA records have identified differences in AI-related descriptions, and reviews of public regulatory documents have found uneven reporting of device evaluation and other attributes.</w:t>
+      </w:r>
+      <w:r>
+        <w:rPr>
+          <w:vertAlign w:val="superscript"/>
+        </w:rPr>
+        <w:t>6,7</w:t>
+      </w:r>
+      <w:r>
+        <w:t xml:space="preserve"> Recent work on regulatory databases highlights the need for searchable descriptions, structured metadata, and links between device versions.</w:t>
+      </w:r>
+      <w:r>
+        <w:rPr>
+          <w:vertAlign w:val="superscript"/>
+        </w:rPr>
+        <w:t>8</w:t>
+      </w:r>
+      <w:r>
+        <w:t xml:space="preserve"> A reusable annotation resource therefore needs to connect each classification to the source passage, document version, and function to which it applies.</w:t>
       </w:r>
     </w:p>
     <w:p>
@@ -229,25 +262,25 @@
         <w:widowControl/>
       </w:pPr>
       <w:r>
-        <w:t>Previous studies have classified clinical and AI functions across FDA authorizations and characterized intended use and clinician-facing interfaces.</w:t>
+        <w:t>The clinical meaning of an AI function depends on more than its output category. Joint FDA, Health Canada, and Medicines and Healthcare products Regulatory Agency transparency principles emphasize intended users, inputs and outputs, use environments, and the role of device information in decisions.</w:t>
       </w:r>
       <w:r>
         <w:rPr>
           <w:vertAlign w:val="superscript"/>
         </w:rPr>
-        <w:t>2,3</w:t>
+        <w:t>9</w:t>
       </w:r>
       <w:r>
-        <w:t xml:space="preserve"> Work on automated regulatory-document extraction and structured clinical AI documentation further shows the value of organizing these descriptions for analysis.</w:t>
+        <w:t xml:space="preserve"> MINIMAR addresses intended predictions and the populations in which systems are developed and evaluated; DECIDE-AI places early clinical evaluation in its workflow and human-interaction context.</w:t>
       </w:r>
       <w:r>
         <w:rPr>
           <w:vertAlign w:val="superscript"/>
         </w:rPr>
-        <w:t>4,5</w:t>
+        <w:t>10,11</w:t>
       </w:r>
       <w:r>
-        <w:t xml:space="preserve"> Our resource extends this work through an authorization-level release that combines six annotation fields with explicit assessment states, field-linked provenance, source-association records, and executable integrity checks. These features allow users to inspect both a label and the scope of its supporting source.</w:t>
+        <w:t xml:space="preserve"> These perspectives motivate describing inputs, outputs, intended users, settings, and downstream actions together, while retaining the distinction between a whole-device description and an AI-related function.</w:t>
       </w:r>
     </w:p>
     <w:p>
@@ -255,13 +288,46 @@
         <w:widowControl/>
       </w:pPr>
       <w:r>
-        <w:t>We organize a defined cohort into linked tables for authorizations, annotations, label memberships, and evidence (Fig. 1). A researcher can use the resource to retrieve source documents for a chosen input or output category, distinguish field-specific missing information from unresolved AI attribution, or assemble a documented sample for subsequent annotation validation. Stable identifiers, dictionaries, and version records support these uses and the traceability and reuse objectives of the FAIR principles.</w:t>
+        <w:t>Large language models have been used to extract attributes from regulatory documents, and structured documentation frameworks organize information about clinical AI systems.</w:t>
       </w:r>
       <w:r>
         <w:rPr>
           <w:vertAlign w:val="superscript"/>
         </w:rPr>
-        <w:t>6</w:t>
+        <w:t>12,13</w:t>
+      </w:r>
+      <w:r>
+        <w:t xml:space="preserve"> Related data resources illustrate complementary approaches to source traceability. SPIRIT-CONSORT-TM links clinical-trial annotations across text levels, and Aci-bench retains original and corrected clinical-text representations.</w:t>
+      </w:r>
+      <w:r>
+        <w:rPr>
+          <w:vertAlign w:val="superscript"/>
+        </w:rPr>
+        <w:t>14,15</w:t>
+      </w:r>
+      <w:r>
+        <w:t xml:space="preserve"> PharmaBench separates extraction of experimental context from subsequent processing, while PCMR records the sources and collection routes of biomedical associations.</w:t>
+      </w:r>
+      <w:r>
+        <w:rPr>
+          <w:vertAlign w:val="superscript"/>
+        </w:rPr>
+        <w:t>16,17</w:t>
+      </w:r>
+      <w:r/>
+    </w:p>
+    <w:p>
+      <w:pPr>
+        <w:widowControl/>
+      </w:pPr>
+      <w:r>
+        <w:t>Here, we provide six-field annotations for a defined cohort of 1524 FDA authorizations, with explicit assessment states, field-linked evidence, source-association records, and executable integrity checks (Fig. 1). Researchers can retrieve documents for a chosen input or output category, distinguish field-specific missing information from unresolved AI attribution, and construct documented subsets for annotation-method development. Stable identifiers, dictionaries, version records, and explicit access arrangements support the traceability and reuse objectives described by FAIR and FAIRsharing.</w:t>
+      </w:r>
+      <w:r>
+        <w:rPr>
+          <w:vertAlign w:val="superscript"/>
+        </w:rPr>
+        <w:t>18,19</w:t>
       </w:r>
       <w:r/>
     </w:p>
@@ -305,8 +371,15 @@
         <w:t>1</w:t>
       </w:r>
       <w:r>
-        <w:t xml:space="preserve"> The retained authorization decision dates range from September 29, 1995, to March 30, 2026. Source retrieval records are dated June 30, 2026. The historical CSV and XLSX snapshots, access metadata, SHA-256 fingerprints, and original record positions are included in the release. Submission number is the linkage key, and device name and company are descriptive attributes. Multiple authorizations for a product family remain separate records. The observation unit is therefore an authorization, with products, internal models, and clinical deployments represented only insofar as they are described in the source material.</w:t>
+        <w:t xml:space="preserve"> The retained authorization decision dates range from September 29, 1995, to March 30, 2026. Source retrieval records are dated June 30, 2026. The historical CSV and XLSX snapshots, access metadata, SHA-256 fingerprints, and original record positions are included in the release. Submission number is the linkage key, and device name and company are descriptive attributes. Multiple authorizations for a product family remain separate records. The observation unit is therefore an authorization, with products, internal models, and clinical deployments represented only insofar as they are described in the source material. Explicit documentation of the observation unit, cohort selection, and annotation context supports the interpretation of derived datasets and text corpora.</w:t>
       </w:r>
+      <w:r>
+        <w:rPr>
+          <w:vertAlign w:val="superscript"/>
+        </w:rPr>
+        <w:t>20,21</w:t>
+      </w:r>
+      <w:r/>
     </w:p>
     <w:p>
       <w:pPr>
@@ -360,7 +433,7 @@
         <w:rPr>
           <w:vertAlign w:val="superscript"/>
         </w:rPr>
-        <w:t>7</w:t>
+        <w:t>22</w:t>
       </w:r>
       <w:r/>
     </w:p>
@@ -369,7 +442,7 @@
         <w:widowControl/>
       </w:pPr>
       <w:r>
-        <w:t>For authorizations with multiple functions, the first five fields contain the union of the supported labels. Indications for Use statements and other eligible passages contribute to the same six fields. Input–output–action membership is represented at the authorization level.</w:t>
+        <w:t>For authorizations with multiple functions, the first five fields contain the union of the supported labels. Indications for Use statements and other eligible passages contribute to the same six fields. Input–output–action membership is represented at the authorization level. Table 3 illustrates selected applications of the attribution, output-category, and grouping rules.</w:t>
       </w:r>
     </w:p>
     <w:p>
@@ -419,15 +492,40 @@
         <w:widowControl/>
       </w:pPr>
       <w:r>
-        <w:t>Each annotation identifier combines submission number and field name. Baseline and current values are retained, and positive labels are expanded into annotation–code membership rows. The cumulative amendment ledger contains 16 changed cells across four authorizations: eight prior amendments and eight amendments from the September 8 confirmation. Thirteen changes concern annotation fields and three concern scope. Input-file hashes and review provenance identify the successive annotation versions.</w:t>
+        <w:t>Each annotation identifier combines submission number and field name. Baseline and current values are retained, and positive labels are expanded into annotation–code membership rows. The cumulative amendment ledger contains 16 changed cells across four authorizations: eight prior amendments and eight amendments from the September 8 confirmation. Thirteen changes concern annotation fields and three concern scope. Input-file hashes and review provenance identify the successive annotation versions. Provenance models represent links to source material and revisions of earlier records.</w:t>
       </w:r>
+      <w:r>
+        <w:rPr>
+          <w:vertAlign w:val="superscript"/>
+        </w:rPr>
+        <w:t>23</w:t>
+      </w:r>
+      <w:r>
+        <w:t xml:space="preserve"> Retaining the inputs and executable transformations also supports reconstruction of the derived tables.</w:t>
+      </w:r>
+      <w:r>
+        <w:rPr>
+          <w:vertAlign w:val="superscript"/>
+        </w:rPr>
+        <w:t>24</w:t>
+      </w:r>
+      <w:r/>
     </w:p>
     <w:p>
       <w:pPr>
         <w:widowControl/>
       </w:pPr>
       <w:r>
-        <w:t>Evidence records link annotation identifiers to source-record identifiers and preserve the recorded public URL. URL-token checks identify references to the subject authorization, alternate identifiers, or another authorization. Cross-authorization references receive a separate source-association review because an earlier authorization can describe an inherited or integrated function. The resulting relationship and caution codes are retained with the original labels.</w:t>
+        <w:t>Evidence records link annotation identifiers to source-record identifiers and preserve the recorded public URL. URL-token checks identify references to the subject authorization, alternate identifiers, or another authorization. Cross-authorization references receive a separate source-association review because an earlier authorization can describe an inherited or integrated function. Published analyses of 510(k) predicate networks show why links between authorizations require examination of the functions described in each submission.</w:t>
+      </w:r>
+      <w:r>
+        <w:rPr>
+          <w:vertAlign w:val="superscript"/>
+        </w:rPr>
+        <w:t>25</w:t>
+      </w:r>
+      <w:r>
+        <w:t xml:space="preserve"> The resulting relationship and caution codes are retained with the original labels.</w:t>
       </w:r>
     </w:p>
     <w:p>
@@ -469,7 +567,16 @@
         <w:widowControl/>
       </w:pPr>
       <w:r>
-        <w:t>Version 1.3.0 is available at https://github.com/wang177777/fda-ai-clinical-function-annotations/releases/tag/v1.3.0. The release contains 15 UTF-8 comma-separated data tables, documentation, code, and source-material archives. Table 1 lists the principal files and their units. authorizations.csv supplies the submission key, field_annotations.csv holds six records per authorization, and positive_labels.csv records memberships for the first five fields. Clinical-function grouping remains in the authorization and field tables. Evidence references are assigned to fields and accompany their positive-label sets.</w:t>
+        <w:t>Version 1.3.0 is available at https://github.com/wang177777/fda-ai-clinical-function-annotations/releases/tag/v1.3.0.</w:t>
+      </w:r>
+      <w:r>
+        <w:rPr>
+          <w:vertAlign w:val="superscript"/>
+        </w:rPr>
+        <w:t>26</w:t>
+      </w:r>
+      <w:r>
+        <w:t xml:space="preserve"> The release contains 15 UTF-8 comma-separated data tables, documentation, code, and source-material archives. Table 1 lists the principal files and their units. authorizations.csv supplies the submission key, field_annotations.csv holds six records per authorization, and positive_labels.csv records memberships for the first five fields. Clinical-function grouping remains in the authorization and field tables. Evidence references are assigned to fields and accompany their positive-label sets.</w:t>
       </w:r>
     </w:p>
     <w:p>
@@ -636,7 +743,16 @@
         <w:widowControl/>
       </w:pPr>
       <w:r>
-        <w:t>Semantic accuracy and label completeness were not independently estimated. Paired pre-discussion ratings were unavailable, so inter-rater agreement was not calculated. Reuse should account for annotation scope, field-specific limitations, and shared products or source documents.</w:t>
+        <w:t>Semantic accuracy and label completeness were not independently estimated. Paired pre-discussion ratings were unavailable, so inter-rater agreement was not calculated; such estimates require separately recorded coding judgments.</w:t>
+      </w:r>
+      <w:r>
+        <w:rPr>
+          <w:vertAlign w:val="superscript"/>
+        </w:rPr>
+        <w:t>27</w:t>
+      </w:r>
+      <w:r>
+        <w:t xml:space="preserve"> Reuse should account for annotation scope, field-specific limitations, and shared products or source documents.</w:t>
       </w:r>
     </w:p>
     <w:p>
@@ -677,8 +793,33 @@
         <w:widowControl/>
       </w:pPr>
       <w:r>
-        <w:t>The data support descriptive reuse, source retrieval, and annotation-method development. Regulatory descriptions alone do not establish clinical safety or effectiveness. Related authorizations and shared documents create dependencies; model-development studies should assess leakage across authorizations, product families, manufacturers, and source documents. Record the dataset version, selection rules, and any subsequent source-based corrections.</w:t>
+        <w:t>The data support descriptive reuse, source retrieval, and annotation-method development. Analyses of public descriptions should distinguish the information reported from the rigor of the underlying device evaluation.</w:t>
       </w:r>
+      <w:r>
+        <w:rPr>
+          <w:vertAlign w:val="superscript"/>
+        </w:rPr>
+        <w:t>28</w:t>
+      </w:r>
+      <w:r>
+        <w:t xml:space="preserve"> Related authorizations and shared documents create dependencies; model-development studies should assess leakage across authorizations, product families, manufacturers, and source documents.</w:t>
+      </w:r>
+      <w:r>
+        <w:rPr>
+          <w:vertAlign w:val="superscript"/>
+        </w:rPr>
+        <w:t>29</w:t>
+      </w:r>
+      <w:r>
+        <w:t xml:space="preserve"> Record the dataset version, selection rules, and any subsequent source-based corrections, and cite the version used.</w:t>
+      </w:r>
+      <w:r>
+        <w:rPr>
+          <w:vertAlign w:val="superscript"/>
+        </w:rPr>
+        <w:t>30</w:t>
+      </w:r>
+      <w:r/>
     </w:p>
     <w:p>
       <w:pPr>
@@ -694,7 +835,16 @@
         <w:widowControl/>
       </w:pPr>
       <w:r>
-        <w:t>The annotation tables, dictionaries, historical cohort files, retained source materials, and scientific reconstruction inputs are openly available in release v1.3.0 at https://github.com/wang177777/fda-ai-clinical-function-annotations/releases/tag/v1.3.0. The repository provides individual derived files and downloadable source archives with SHA-256 manifests. Author-created data and documentation are licensed under CC BY 4.0. FDA-hosted source materials retain their original attribution and rights.</w:t>
+        <w:t>The annotation tables, dictionaries, historical cohort files, retained source materials, and scientific reconstruction inputs are openly available in release v1.3.0 at https://github.com/wang177777/fda-ai-clinical-function-annotations/releases/tag/v1.3.0.</w:t>
+      </w:r>
+      <w:r>
+        <w:rPr>
+          <w:vertAlign w:val="superscript"/>
+        </w:rPr>
+        <w:t>26</w:t>
+      </w:r>
+      <w:r>
+        <w:t xml:space="preserve"> The repository provides individual derived files and downloadable source archives with SHA-256 manifests. Author-created data and documentation are licensed under CC BY 4.0. FDA-hosted source materials retain their original attribution and rights.</w:t>
       </w:r>
     </w:p>
     <w:p>
@@ -711,8 +861,15 @@
         <w:widowControl/>
       </w:pPr>
       <w:r>
-        <w:t>The assembly, validation, source-download, and retrieval scripts are available at https://github.com/wang177777/fda-ai-clinical-function-annotations/tree/v1.3.0/scripts under the MIT license. Data reconstruction and validation use Python 3.10 or later and the standard library. The repository documents how to download the source archives, reproduce the derived tables, and repeat the evidence-location checks. Figure-generation code and its rendering dependencies are provided in figure_generation/.</w:t>
+        <w:t>The assembly, validation, source-download, and retrieval scripts are available at https://github.com/wang177777/fda-ai-clinical-function-annotations/tree/v1.3.0/scripts under the MIT license. Data reconstruction and validation use Python 3.10 or later and the standard library. The repository documents how to download the source archives, reproduce the derived tables, and repeat the evidence-location checks. Figure-generation code and its rendering dependencies are provided in figure_generation/. The repository brings the code, data documentation, license information, and validation commands together using practices described for reusable scientific computing.</w:t>
       </w:r>
+      <w:r>
+        <w:rPr>
+          <w:vertAlign w:val="superscript"/>
+        </w:rPr>
+        <w:t>31</w:t>
+      </w:r>
+      <w:r/>
     </w:p>
     <w:p>
       <w:pPr>
@@ -725,7 +882,10 @@
     </w:p>
     <w:p>
       <w:pPr>
+        <w:keepLines/>
         <w:widowControl/>
+        <w:spacing w:line="288" w:lineRule="auto" w:after="100"/>
+        <w:ind w:left="369" w:hanging="369"/>
       </w:pPr>
       <w:r>
         <w:t>1. US Food and Drug Administration. Artificial Intelligence-Enabled Medical Devices. https://www.fda.gov/medical-devices/software-medical-device-samd/artificial-intelligence-enabled-medical-devices (accessed 29 June 2026).</w:t>
@@ -733,50 +893,376 @@
     </w:p>
     <w:p>
       <w:pPr>
+        <w:keepLines/>
         <w:widowControl/>
+        <w:spacing w:line="288" w:lineRule="auto" w:after="100"/>
+        <w:ind w:left="369" w:hanging="369"/>
       </w:pPr>
       <w:r>
-        <w:t>2. Singh, R., Bapna, M., Diab, A. R., Ruiz, E. S. &amp; Lotter, W. How AI is used in FDA-authorized medical devices: a taxonomy across 1,016 authorizations. npj Digit. Med. 8, 388 (2025). https://doi.org/10.1038/s41746-025-01800-1</w:t>
+        <w:t>2. Benjamens, S., Dhunnoo, P. &amp; Meskó, B. The state of artificial intelligence-based FDA-approved medical devices and algorithms: an online database. npj Digit. Med. 3, 118 (2020). https://doi.org/10.1038/s41746-020-00324-0</w:t>
       </w:r>
     </w:p>
     <w:p>
       <w:pPr>
+        <w:keepLines/>
         <w:widowControl/>
+        <w:spacing w:line="288" w:lineRule="auto" w:after="100"/>
+        <w:ind w:left="369" w:hanging="369"/>
       </w:pPr>
       <w:r>
-        <w:t>3. McNamara, S. L., Yi, P. H. &amp; Lotter, W. The clinician-AI interface: intended use and explainability in FDA-cleared AI devices for medical image interpretation. npj Digit. Med. 7, 80 (2024). https://doi.org/10.1038/s41746-024-01080-1</w:t>
+        <w:t>3. Lyell, D., Coiera, E., Chen, J., Shah, P. &amp; Magrabi, F. How machine learning is embedded to support clinician decision making: an analysis of FDA-approved medical devices. BMJ Health Care Inform. 28, e100301 (2021). https://doi.org/10.1136/bmjhci-2020-100301</w:t>
       </w:r>
     </w:p>
     <w:p>
       <w:pPr>
+        <w:keepLines/>
         <w:widowControl/>
+        <w:spacing w:line="288" w:lineRule="auto" w:after="100"/>
+        <w:ind w:left="369" w:hanging="369"/>
       </w:pPr>
       <w:r>
-        <w:t>4. Li, H. et al. Scaling medical device regulatory science using large language models. npj Digit. Med. 9, 221 (2026). https://doi.org/10.1038/s41746-026-02353-7</w:t>
+        <w:t>4. Singh, R., Bapna, M., Diab, A. R., Ruiz, E. S. &amp; Lotter, W. How AI is used in FDA-authorized medical devices: a taxonomy across 1,016 authorizations. npj Digit. Med. 8, 388 (2025). https://doi.org/10.1038/s41746-025-01800-1</w:t>
       </w:r>
     </w:p>
     <w:p>
       <w:pPr>
+        <w:keepLines/>
         <w:widowControl/>
+        <w:spacing w:line="288" w:lineRule="auto" w:after="100"/>
+        <w:ind w:left="369" w:hanging="369"/>
       </w:pPr>
       <w:r>
-        <w:t>5. Lohachab, A. et al. SMART: structured, meaningful, auditable, responsible, and transparent documentation for clinical AI. J. Am. Med. Inform. Assoc. ocag117 (2026) doi:10.1093/jamia/ocag117.</w:t>
+        <w:t>5. McNamara, S. L., Yi, P. H. &amp; Lotter, W. The clinician-AI interface: intended use and explainability in FDA-cleared AI devices for medical image interpretation. npj Digit. Med. 7, 80 (2024). https://doi.org/10.1038/s41746-024-01080-1</w:t>
       </w:r>
     </w:p>
     <w:p>
       <w:pPr>
+        <w:keepLines/>
         <w:widowControl/>
+        <w:spacing w:line="288" w:lineRule="auto" w:after="100"/>
+        <w:ind w:left="369" w:hanging="369"/>
       </w:pPr>
       <w:r>
-        <w:t>6. Wilkinson, M. D. et al. The FAIR Guiding Principles for scientific data management and stewardship. Sci. Data 3, 160018 (2016). https://doi.org/10.1038/sdata.2016.18</w:t>
+        <w:t>6. Clark, P., Kim, J. &amp; Aphinyanaphongs, Y. Marketing and US Food and Drug Administration Clearance of Artificial Intelligence and Machine Learning Enabled Software in and as Medical Devices: A Systematic Review. JAMA Netw. Open 6, e2321792 (2023). https://doi.org/10.1001/jamanetworkopen.2023.21792</w:t>
       </w:r>
     </w:p>
     <w:p>
       <w:pPr>
+        <w:keepLines/>
         <w:widowControl/>
+        <w:spacing w:line="288" w:lineRule="auto" w:after="100"/>
+        <w:ind w:left="369" w:hanging="369"/>
       </w:pPr>
       <w:r>
-        <w:t>7. US Food and Drug Administration. Multiple Function Device Products: Policy and Considerations. https://www.fda.gov/regulatory-information/search-fda-guidance-documents/multiple-function-device-products-policy-and-considerations (2020).</w:t>
+        <w:t>7. Muralidharan, V. et al. A scoping review of reporting gaps in FDA-approved AI medical devices. npj Digit. Med. 7, 273 (2024). https://doi.org/10.1038/s41746-024-01270-x</w:t>
+      </w:r>
+    </w:p>
+    <w:p>
+      <w:pPr>
+        <w:keepLines/>
+        <w:widowControl/>
+        <w:spacing w:line="288" w:lineRule="auto" w:after="100"/>
+        <w:ind w:left="369" w:hanging="369"/>
+      </w:pPr>
+      <w:r>
+        <w:t>8. Ong, A. Y. et al. Current challenges and the way forwards for regulatory databases of artificial intelligence as a medical device. npj Digit. Med. 9, 235 (2026). https://doi.org/10.1038/s41746-026-02407-w</w:t>
+      </w:r>
+    </w:p>
+    <w:p>
+      <w:pPr>
+        <w:keepLines/>
+        <w:widowControl/>
+        <w:spacing w:line="288" w:lineRule="auto" w:after="100"/>
+        <w:ind w:left="369" w:hanging="369"/>
+      </w:pPr>
+      <w:r>
+        <w:t>9. US Food and Drug Administration, Health Canada &amp; Medicines and Healthcare products Regulatory Agency. Transparency for Machine Learning-Enabled Medical Devices: Guiding Principles. https://www.fda.gov/medical-devices/software-medical-device-samd/transparency-machine-learning-enabled-medical-devices-guiding-principles (2024).</w:t>
+      </w:r>
+    </w:p>
+    <w:p>
+      <w:pPr>
+        <w:keepLines/>
+        <w:widowControl/>
+        <w:spacing w:line="288" w:lineRule="auto" w:after="100"/>
+        <w:ind w:left="369" w:hanging="369"/>
+      </w:pPr>
+      <w:r>
+        <w:t>10. Hernandez-Boussard, T., Bozkurt, S., Ioannidis, J. P. A. &amp; Shah, N. H. MINIMAR (MINimum Information for Medical AI Reporting): Developing reporting standards for artificial intelligence in health care. J. Am. Med. Inform. Assoc. 27, 2011–2015 (2020). https://doi.org/10.1093/jamia/ocaa088</w:t>
+      </w:r>
+    </w:p>
+    <w:p>
+      <w:pPr>
+        <w:keepLines/>
+        <w:widowControl/>
+        <w:spacing w:line="288" w:lineRule="auto" w:after="100"/>
+        <w:ind w:left="369" w:hanging="369"/>
+      </w:pPr>
+      <w:r>
+        <w:t>11. Vasey, B. et al. Reporting guideline for the early-stage clinical evaluation of decision support systems driven by artificial intelligence: DECIDE-AI. Nat. Med. 28, 924–933 (2022). https://doi.org/10.1038/s41591-022-01772-9</w:t>
+      </w:r>
+    </w:p>
+    <w:p>
+      <w:pPr>
+        <w:keepLines/>
+        <w:widowControl/>
+        <w:spacing w:line="288" w:lineRule="auto" w:after="100"/>
+        <w:ind w:left="369" w:hanging="369"/>
+      </w:pPr>
+      <w:r>
+        <w:t>12. Li, H. et al. Scaling medical device regulatory science using large language models. npj Digit. Med. 9, 221 (2026). https://doi.org/10.1038/s41746-026-02353-7</w:t>
+      </w:r>
+    </w:p>
+    <w:p>
+      <w:pPr>
+        <w:keepLines/>
+        <w:widowControl/>
+        <w:spacing w:line="288" w:lineRule="auto" w:after="100"/>
+        <w:ind w:left="369" w:hanging="369"/>
+      </w:pPr>
+      <w:r>
+        <w:t>13. Lohachab, A. et al. SMART: structured, meaningful, auditable, responsible, and transparent documentation for clinical AI. J. Am. Med. Inform. Assoc. ocag117 (2026). https://doi.org/10.1093/jamia/ocag117</w:t>
+      </w:r>
+    </w:p>
+    <w:p>
+      <w:pPr>
+        <w:keepLines/>
+        <w:widowControl/>
+        <w:spacing w:line="288" w:lineRule="auto" w:after="100"/>
+        <w:ind w:left="369" w:hanging="369"/>
+      </w:pPr>
+      <w:r>
+        <w:t>14. Jiang, L. et al. SPIRIT-CONSORT-TM: a corpus for assessing transparency of clinical trial protocol and results publications. Sci. Data 12, 355 (2025). https://doi.org/10.1038/s41597-025-04629-1</w:t>
+      </w:r>
+    </w:p>
+    <w:p>
+      <w:pPr>
+        <w:keepLines/>
+        <w:widowControl/>
+        <w:spacing w:line="288" w:lineRule="auto" w:after="100"/>
+        <w:ind w:left="369" w:hanging="369"/>
+      </w:pPr>
+      <w:r>
+        <w:t>15. Yim, W.-w. et al. Aci-bench: a Novel Ambient Clinical Intelligence Dataset for Benchmarking Automatic Visit Note Generation. Sci. Data 10, 586 (2023). https://doi.org/10.1038/s41597-023-02487-3</w:t>
+      </w:r>
+    </w:p>
+    <w:p>
+      <w:pPr>
+        <w:keepLines/>
+        <w:widowControl/>
+        <w:spacing w:line="288" w:lineRule="auto" w:after="100"/>
+        <w:ind w:left="369" w:hanging="369"/>
+      </w:pPr>
+      <w:r>
+        <w:t>16. Niu, Z. et al. PharmaBench: Enhancing ADMET benchmarks with large language models. Sci. Data 11, 985 (2024). https://doi.org/10.1038/s41597-024-03793-0</w:t>
+      </w:r>
+    </w:p>
+    <w:p>
+      <w:pPr>
+        <w:keepLines/>
+        <w:widowControl/>
+        <w:spacing w:line="288" w:lineRule="auto" w:after="100"/>
+        <w:ind w:left="369" w:hanging="369"/>
+      </w:pPr>
+      <w:r>
+        <w:t>17. Xiong, Y. et al. PCMR: a comprehensive precancerous molecular resource. Sci. Data 12, 551 (2025). https://doi.org/10.1038/s41597-025-04899-9</w:t>
+      </w:r>
+    </w:p>
+    <w:p>
+      <w:pPr>
+        <w:keepLines/>
+        <w:widowControl/>
+        <w:spacing w:line="288" w:lineRule="auto" w:after="100"/>
+        <w:ind w:left="369" w:hanging="369"/>
+      </w:pPr>
+      <w:r>
+        <w:t>18. Wilkinson, M. D. et al. The FAIR Guiding Principles for scientific data management and stewardship. Sci. Data 3, 160018 (2016). https://doi.org/10.1038/sdata.2016.18</w:t>
+      </w:r>
+    </w:p>
+    <w:p>
+      <w:pPr>
+        <w:keepLines/>
+        <w:widowControl/>
+        <w:spacing w:line="288" w:lineRule="auto" w:after="100"/>
+        <w:ind w:left="369" w:hanging="369"/>
+      </w:pPr>
+      <w:r>
+        <w:t>19. Sansone, S.-A. et al. FAIRsharing as a community approach to standards, repositories and policies. Nat. Biotechnol. 37, 358–367 (2019). https://doi.org/10.1038/s41587-019-0080-8</w:t>
+      </w:r>
+    </w:p>
+    <w:p>
+      <w:pPr>
+        <w:keepLines/>
+        <w:widowControl/>
+        <w:spacing w:line="288" w:lineRule="auto" w:after="100"/>
+        <w:ind w:left="369" w:hanging="369"/>
+      </w:pPr>
+      <w:r>
+        <w:t>20. Gebru, T. et al. Datasheets for Datasets. Commun. ACM 64, 86–92 (2021). https://doi.org/10.1145/3458723</w:t>
+      </w:r>
+    </w:p>
+    <w:p>
+      <w:pPr>
+        <w:keepLines/>
+        <w:widowControl/>
+        <w:spacing w:line="288" w:lineRule="auto" w:after="100"/>
+        <w:ind w:left="369" w:hanging="369"/>
+      </w:pPr>
+      <w:r>
+        <w:t>21. Bender, E. M. &amp; Friedman, B. Data Statements for Natural Language Processing: Toward Mitigating System Bias and Enabling Better Science. Trans. Assoc. Comput. Linguist. 6, 587–604 (2018). https://doi.org/10.1162/tacl_a_00041</w:t>
+      </w:r>
+    </w:p>
+    <w:p>
+      <w:pPr>
+        <w:keepLines/>
+        <w:widowControl/>
+        <w:spacing w:line="288" w:lineRule="auto" w:after="100"/>
+        <w:ind w:left="369" w:hanging="369"/>
+      </w:pPr>
+      <w:r>
+        <w:t>22. US Food and Drug Administration. Multiple Function Device Products: Policy and Considerations. https://www.fda.gov/regulatory-information/search-fda-guidance-documents/multiple-function-device-products-policy-and-considerations (2020).</w:t>
+      </w:r>
+    </w:p>
+    <w:p>
+      <w:pPr>
+        <w:keepLines/>
+        <w:widowControl/>
+        <w:spacing w:line="288" w:lineRule="auto" w:after="100"/>
+        <w:ind w:left="369" w:hanging="369"/>
+      </w:pPr>
+      <w:r>
+        <w:t>23. Moreau, L. &amp; Missier, P. (eds.) PROV-DM: The PROV Data Model. W3C Recommendation (2013). https://www.w3.org/TR/2013/REC-prov-dm-20130430/</w:t>
+      </w:r>
+    </w:p>
+    <w:p>
+      <w:pPr>
+        <w:keepLines/>
+        <w:widowControl/>
+        <w:spacing w:line="288" w:lineRule="auto" w:after="100"/>
+        <w:ind w:left="369" w:hanging="369"/>
+      </w:pPr>
+      <w:r>
+        <w:t>24. Sandve, G. K., Nekrutenko, A., Taylor, J. &amp; Hovig, E. Ten simple rules for reproducible computational research. PLoS Comput. Biol. 9, e1003285 (2013). https://doi.org/10.1371/journal.pcbi.1003285</w:t>
+      </w:r>
+    </w:p>
+    <w:p>
+      <w:pPr>
+        <w:keepLines/>
+        <w:widowControl/>
+        <w:spacing w:line="288" w:lineRule="auto" w:after="100"/>
+        <w:ind w:left="369" w:hanging="369"/>
+      </w:pPr>
+      <w:r>
+        <w:t>25. Muehlematter, U. J., Bluethgen, C. &amp; Vokinger, K. N. FDA-cleared artificial intelligence and machine learning-based medical devices and their 510(k) predicate networks. Lancet Digit. Health 5, e618–e626 (2023). https://doi.org/10.1016/S2589-7500(23)00126-7</w:t>
+      </w:r>
+    </w:p>
+    <w:p>
+      <w:pPr>
+        <w:keepLines/>
+        <w:widowControl/>
+        <w:spacing w:line="288" w:lineRule="auto" w:after="100"/>
+        <w:ind w:left="369" w:hanging="369"/>
+      </w:pPr>
+      <w:r>
+        <w:t>26. Wang, G. et al. Clinical-function annotations for 1524 US artificial intelligence medical-device authorizations (v1.3.0). GitHub https://github.com/wang177777/fda-ai-clinical-function-annotations/releases/tag/v1.3.0 (2026).</w:t>
+      </w:r>
+    </w:p>
+    <w:p>
+      <w:pPr>
+        <w:keepLines/>
+        <w:widowControl/>
+        <w:spacing w:line="288" w:lineRule="auto" w:after="100"/>
+        <w:ind w:left="369" w:hanging="369"/>
+      </w:pPr>
+      <w:r>
+        <w:t>27. Artstein, R. &amp; Poesio, M. Inter-Coder Agreement for Computational Linguistics. Comput. Linguist. 34, 555–596 (2008). https://doi.org/10.1162/coli.07-034-R2</w:t>
+      </w:r>
+    </w:p>
+    <w:p>
+      <w:pPr>
+        <w:keepLines/>
+        <w:widowControl/>
+        <w:spacing w:line="288" w:lineRule="auto" w:after="100"/>
+        <w:ind w:left="369" w:hanging="369"/>
+      </w:pPr>
+      <w:r>
+        <w:t>28. Diab, A. R. &amp; Lotter, W. Distinguishing between Rigor and Transparency in FDA Marketing Authorization of AI-enabled Medical Devices. Radiol. Artif. Intell. 7, e250369 (2025). https://doi.org/10.1148/ryai.250369</w:t>
+      </w:r>
+    </w:p>
+    <w:p>
+      <w:pPr>
+        <w:keepLines/>
+        <w:widowControl/>
+        <w:spacing w:line="288" w:lineRule="auto" w:after="100"/>
+        <w:ind w:left="369" w:hanging="369"/>
+      </w:pPr>
+      <w:r>
+        <w:t>29. Kapoor, S. &amp; Narayanan, A. Leakage and the reproducibility crisis in machine-learning-based science. Patterns 4, 100804 (2023). https://doi.org/10.1016/j.patter.2023.100804</w:t>
+      </w:r>
+    </w:p>
+    <w:p>
+      <w:pPr>
+        <w:keepLines/>
+        <w:widowControl/>
+        <w:spacing w:line="288" w:lineRule="auto" w:after="100"/>
+        <w:ind w:left="369" w:hanging="369"/>
+      </w:pPr>
+      <w:r>
+        <w:t>30. Cousijn, H. et al. A data citation roadmap for scientific publishers. Sci. Data 5, 180259 (2018). https://doi.org/10.1038/sdata.2018.259</w:t>
+      </w:r>
+    </w:p>
+    <w:p>
+      <w:pPr>
+        <w:keepLines/>
+        <w:widowControl/>
+        <w:spacing w:line="288" w:lineRule="auto" w:after="100"/>
+        <w:ind w:left="369" w:hanging="369"/>
+      </w:pPr>
+      <w:r>
+        <w:t>31. Wilson, G. et al. Good enough practices in scientific computing. PLoS Comput. Biol. 13, e1005510 (2017). https://doi.org/10.1371/journal.pcbi.1005510</w:t>
+      </w:r>
+    </w:p>
+    <w:p>
+      <w:pPr>
+        <w:keepLines/>
+        <w:widowControl/>
+        <w:spacing w:line="288" w:lineRule="auto" w:after="100"/>
+        <w:ind w:left="369" w:hanging="369"/>
+      </w:pPr>
+      <w:r>
+        <w:t>32. LabStyle Innovation Ltd. 510(k) Summary [Dario Blood Glucose Monitoring System; K150817]. https://www.accessdata.fda.gov/cdrh_docs/pdf15/K150817.pdf (2015).</w:t>
+      </w:r>
+    </w:p>
+    <w:p>
+      <w:pPr>
+        <w:keepLines/>
+        <w:widowControl/>
+        <w:spacing w:line="288" w:lineRule="auto" w:after="100"/>
+        <w:ind w:left="369" w:hanging="369"/>
+      </w:pPr>
+      <w:r>
+        <w:t>33. Arterys Inc. Section 5. 510(k) Summary [Arterys MICA; K182034]. https://www.accessdata.fda.gov/cdrh_docs/pdf18/K182034.pdf (2018).</w:t>
+      </w:r>
+    </w:p>
+    <w:p>
+      <w:pPr>
+        <w:keepLines/>
+        <w:widowControl/>
+        <w:spacing w:line="288" w:lineRule="auto" w:after="100"/>
+        <w:ind w:left="369" w:hanging="369"/>
+      </w:pPr>
+      <w:r>
+        <w:t>34. WellDoc, Inc. K190013 510(k) Summary [WellDoc BlueStar]. https://www.accessdata.fda.gov/cdrh_docs/pdf19/K190013.pdf (2019).</w:t>
+      </w:r>
+    </w:p>
+    <w:p>
+      <w:pPr>
+        <w:keepLines/>
+        <w:widowControl/>
+        <w:spacing w:line="288" w:lineRule="auto" w:after="100"/>
+        <w:ind w:left="369" w:hanging="369"/>
+      </w:pPr>
+      <w:r>
+        <w:t>35. US Food and Drug Administration. 510(k) Substantial Equivalence Determination Decision Summary [K182513: FluChip-8G Influenza A+B Assay]. https://www.accessdata.fda.gov/cdrh_docs/reviews/K182513.pdf (2019).</w:t>
       </w:r>
     </w:p>
     <w:p>
@@ -2932,7 +3418,43 @@
         <w:widowControl/>
       </w:pPr>
       <w:r>
-        <w:t>The examples illustrate attribution, output-category, and function-grouping decisions in the versioned release. Source URLs, in row order: https://www.accessdata.fda.gov/cdrh_docs/pdf15/K150817.pdf; https://www.accessdata.fda.gov/cdrh_docs/pdf18/K182034.pdf; https://www.accessdata.fda.gov/cdrh_docs/pdf19/K190013.pdf; https://www.accessdata.fda.gov/cdrh_docs/reviews/K182513.pdf. Page numbers count physical PDF pages from one.</w:t>
+        <w:t>The examples illustrate attribution, output-category, and function-grouping decisions in the versioned release. Sources, in row order: the Dario 510(k) summary,</w:t>
+      </w:r>
+      <w:r>
+        <w:rPr>
+          <w:vertAlign w:val="superscript"/>
+        </w:rPr>
+        <w:t>32</w:t>
+      </w:r>
+      <w:r>
+        <w:t xml:space="preserve"> Arterys MICA 510(k) summary,</w:t>
+      </w:r>
+      <w:r>
+        <w:rPr>
+          <w:vertAlign w:val="superscript"/>
+        </w:rPr>
+        <w:t>33</w:t>
+      </w:r>
+      <w:r>
+        <w:t xml:space="preserve"> BlueStar 510(k) summary,</w:t>
+      </w:r>
+      <w:r>
+        <w:rPr>
+          <w:vertAlign w:val="superscript"/>
+        </w:rPr>
+        <w:t>34</w:t>
+      </w:r>
+      <w:r>
+        <w:t xml:space="preserve"> and FluChip-8G FDA decision summary.</w:t>
+      </w:r>
+      <w:r>
+        <w:rPr>
+          <w:vertAlign w:val="superscript"/>
+        </w:rPr>
+        <w:t>35</w:t>
+      </w:r>
+      <w:r>
+        <w:t xml:space="preserve"> Page numbers count physical PDF pages from one.</w:t>
       </w:r>
     </w:p>
     <w:p>

</xml_diff>

<commit_message>
Streamline introduction and distribute citations by claim
</commit_message>
<xml_diff>
--- a/manuscript/Data_Descriptor.docx
+++ b/manuscript/Data_Descriptor.docx
@@ -212,7 +212,7 @@
         <w:widowControl/>
       </w:pPr>
       <w:r>
-        <w:t>Public regulatory documents describe the clinical functions of artificial intelligence (AI)–enabled medical devices through submission summaries, decision documents, and intended-use statements. The US Food and Drug Administration (FDA) list supplies submission identifiers that link these descriptions across records.</w:t>
+        <w:t>Public regulatory documents describe the clinical functions of artificial intelligence (AI)–enabled medical devices through submission summaries, decision documents, and intended-use statements. The US Food and Drug Administration (FDA) list provides submission identifiers for locating these records.</w:t>
       </w:r>
       <w:r>
         <w:rPr>
@@ -221,13 +221,31 @@
         <w:t>1</w:t>
       </w:r>
       <w:r>
-        <w:t xml:space="preserve"> Earlier public databases catalogued AI-enabled devices, while subsequent studies examined the clinical tasks, inputs, outputs, and clinician-facing interfaces described in their documentation.</w:t>
+        <w:t xml:space="preserve"> Early work catalogued AI-enabled devices.</w:t>
       </w:r>
       <w:r>
         <w:rPr>
           <w:vertAlign w:val="superscript"/>
         </w:rPr>
-        <w:t>2,3,4,5</w:t>
+        <w:t>2</w:t>
+      </w:r>
+      <w:r>
+        <w:t xml:space="preserve"> Subsequent studies characterized clinical tasks, inputs, and outputs.</w:t>
+      </w:r>
+      <w:r>
+        <w:rPr>
+          <w:vertAlign w:val="superscript"/>
+        </w:rPr>
+        <w:t>3,4</w:t>
+      </w:r>
+      <w:r>
+        <w:t xml:space="preserve"> Imaging-focused work examined intended use and clinician-facing interfaces.</w:t>
+      </w:r>
+      <w:r>
+        <w:rPr>
+          <w:vertAlign w:val="superscript"/>
+        </w:rPr>
+        <w:t>5</w:t>
       </w:r>
       <w:r/>
     </w:p>
@@ -236,16 +254,25 @@
         <w:widowControl/>
       </w:pPr>
       <w:r>
-        <w:t>The choice of source affects what can be extracted. Comparisons of marketing material with FDA records have identified differences in AI-related descriptions, and reviews of public regulatory documents have found uneven reporting of device evaluation and other attributes.</w:t>
+        <w:t>Extracted descriptions depend on the source. Marketing material and FDA records can differ in their AI-related descriptions.</w:t>
       </w:r>
       <w:r>
         <w:rPr>
           <w:vertAlign w:val="superscript"/>
         </w:rPr>
-        <w:t>6,7</w:t>
+        <w:t>6</w:t>
       </w:r>
       <w:r>
-        <w:t xml:space="preserve"> Recent work on regulatory databases highlights the need for searchable descriptions, structured metadata, and links between device versions.</w:t>
+        <w:t xml:space="preserve"> Public regulatory documents also vary in their reporting of device evaluation and other attributes.</w:t>
+      </w:r>
+      <w:r>
+        <w:rPr>
+          <w:vertAlign w:val="superscript"/>
+        </w:rPr>
+        <w:t>7</w:t>
+      </w:r>
+      <w:r>
+        <w:t xml:space="preserve"> Recent analyses of regulatory databases identify searchable descriptions, structured metadata, and links between device versions as priorities.</w:t>
       </w:r>
       <w:r>
         <w:rPr>
@@ -253,16 +280,14 @@
         </w:rPr>
         <w:t>8</w:t>
       </w:r>
-      <w:r>
-        <w:t xml:space="preserve"> A reusable annotation resource therefore needs to connect each classification to the source passage, document version, and function to which it applies.</w:t>
-      </w:r>
+      <w:r/>
     </w:p>
     <w:p>
       <w:pPr>
         <w:widowControl/>
       </w:pPr>
       <w:r>
-        <w:t>The clinical meaning of an AI function depends on more than its output category. Joint FDA, Health Canada, and Medicines and Healthcare products Regulatory Agency transparency principles emphasize intended users, inputs and outputs, use environments, and the role of device information in decisions.</w:t>
+        <w:t>Clinical-function descriptions need to place outputs within their intended use context. Joint FDA, Health Canada, and Medicines and Healthcare products Regulatory Agency transparency principles address users, inputs and outputs, use environments, and the role of device information in decisions.</w:t>
       </w:r>
       <w:r>
         <w:rPr>
@@ -271,48 +296,22 @@
         <w:t>9</w:t>
       </w:r>
       <w:r>
-        <w:t xml:space="preserve"> MINIMAR addresses intended predictions and the populations in which systems are developed and evaluated; DECIDE-AI places early clinical evaluation in its workflow and human-interaction context.</w:t>
+        <w:t xml:space="preserve"> MINIMAR addresses intended predictions and the populations in which systems are developed and evaluated.</w:t>
       </w:r>
       <w:r>
         <w:rPr>
           <w:vertAlign w:val="superscript"/>
         </w:rPr>
-        <w:t>10,11</w:t>
+        <w:t>10</w:t>
       </w:r>
       <w:r>
-        <w:t xml:space="preserve"> These perspectives motivate describing inputs, outputs, intended users, settings, and downstream actions together, while retaining the distinction between a whole-device description and an AI-related function.</w:t>
-      </w:r>
-    </w:p>
-    <w:p>
-      <w:pPr>
-        <w:widowControl/>
-      </w:pPr>
-      <w:r>
-        <w:t>Large language models have been used to extract attributes from regulatory documents, and structured documentation frameworks organize information about clinical AI systems.</w:t>
+        <w:t xml:space="preserve"> DECIDE-AI emphasizes workflow and human interaction during early clinical evaluation.</w:t>
       </w:r>
       <w:r>
         <w:rPr>
           <w:vertAlign w:val="superscript"/>
         </w:rPr>
-        <w:t>12,13</w:t>
-      </w:r>
-      <w:r>
-        <w:t xml:space="preserve"> Related data resources illustrate complementary approaches to source traceability. SPIRIT-CONSORT-TM links clinical-trial annotations across text levels, and Aci-bench retains original and corrected clinical-text representations.</w:t>
-      </w:r>
-      <w:r>
-        <w:rPr>
-          <w:vertAlign w:val="superscript"/>
-        </w:rPr>
-        <w:t>14,15</w:t>
-      </w:r>
-      <w:r>
-        <w:t xml:space="preserve"> PharmaBench separates extraction of experimental context from subsequent processing, while PCMR records the sources and collection routes of biomedical associations.</w:t>
-      </w:r>
-      <w:r>
-        <w:rPr>
-          <w:vertAlign w:val="superscript"/>
-        </w:rPr>
-        <w:t>16,17</w:t>
+        <w:t>11</w:t>
       </w:r>
       <w:r/>
     </w:p>
@@ -321,23 +320,50 @@
         <w:widowControl/>
       </w:pPr>
       <w:r>
-        <w:t>Here, we provide six-field annotations for a defined cohort of 1524 FDA authorizations, with explicit assessment states, field-linked evidence, source-association records, and executable integrity checks (Fig. 1). Researchers can retrieve documents for a chosen input or output category, distinguish field-specific missing information from unresolved AI attribution, and construct documented subsets for annotation-method development. Stable identifiers, dictionaries, version records, and explicit access arrangements support the traceability and reuse objectives described by FAIR and FAIRsharing.</w:t>
+        <w:t>Large language models have been used to extract attributes from regulatory documents.</w:t>
       </w:r>
       <w:r>
         <w:rPr>
           <w:vertAlign w:val="superscript"/>
         </w:rPr>
-        <w:t>18,19</w:t>
+        <w:t>12</w:t>
       </w:r>
-      <w:r/>
+      <w:r>
+        <w:t xml:space="preserve"> SMART organizes documentation of clinical AI systems into a structured framework.</w:t>
+      </w:r>
+      <w:r>
+        <w:rPr>
+          <w:vertAlign w:val="superscript"/>
+        </w:rPr>
+        <w:t>13</w:t>
+      </w:r>
+      <w:r>
+        <w:t xml:space="preserve"> SPIRIT-CONSORT-TM links clinical-trial annotations to text at multiple levels.</w:t>
+      </w:r>
+      <w:r>
+        <w:rPr>
+          <w:vertAlign w:val="superscript"/>
+        </w:rPr>
+        <w:t>14</w:t>
+      </w:r>
+      <w:r>
+        <w:t xml:space="preserve"> Applying structured annotation to regulatory documents also requires determining whether a passage describes the whole device or an AI-related function.</w:t>
+      </w:r>
     </w:p>
     <w:p>
       <w:pPr>
         <w:widowControl/>
       </w:pPr>
       <w:r>
-        <w:t>The authorization cohort and part of the downstream-action taxonomy are shared with a broader public-disclosure study. This Data Descriptor documents the six-field annotation resource and its supporting evidence.</w:t>
+        <w:t>Here, we provide six-field annotations for 1524 FDA authorizations: input, output, intended user, setting or use context, downstream action, and clinical-function grouping (Fig. 1). Assessment states, field-linked evidence, and executable checks support source retrieval and documented subset construction. Stable identifiers, dictionaries, and version records support reuse in line with FAIR principles.</w:t>
       </w:r>
+      <w:r>
+        <w:rPr>
+          <w:vertAlign w:val="superscript"/>
+        </w:rPr>
+        <w:t>15</w:t>
+      </w:r>
+      <w:r/>
     </w:p>
     <w:p>
       <w:pPr>
@@ -362,6 +388,14 @@
         <w:widowControl/>
       </w:pPr>
       <w:r>
+        <w:t>The authorization cohort and part of the downstream-action taxonomy are shared with a broader public-disclosure study.</w:t>
+      </w:r>
+    </w:p>
+    <w:p>
+      <w:pPr>
+        <w:widowControl/>
+      </w:pPr>
+      <w:r>
         <w:t>The cohort comprises the 1524 submission-level records in the FDA list accessed June 29, 2026.</w:t>
       </w:r>
       <w:r>
@@ -377,7 +411,7 @@
         <w:rPr>
           <w:vertAlign w:val="superscript"/>
         </w:rPr>
-        <w:t>20,21</w:t>
+        <w:t>16,17</w:t>
       </w:r>
       <w:r/>
     </w:p>
@@ -433,7 +467,7 @@
         <w:rPr>
           <w:vertAlign w:val="superscript"/>
         </w:rPr>
-        <w:t>22</w:t>
+        <w:t>18</w:t>
       </w:r>
       <w:r/>
     </w:p>
@@ -498,7 +532,7 @@
         <w:rPr>
           <w:vertAlign w:val="superscript"/>
         </w:rPr>
-        <w:t>23</w:t>
+        <w:t>19</w:t>
       </w:r>
       <w:r>
         <w:t xml:space="preserve"> Retaining the inputs and executable transformations also supports reconstruction of the derived tables.</w:t>
@@ -507,7 +541,7 @@
         <w:rPr>
           <w:vertAlign w:val="superscript"/>
         </w:rPr>
-        <w:t>24</w:t>
+        <w:t>20</w:t>
       </w:r>
       <w:r/>
     </w:p>
@@ -522,7 +556,7 @@
         <w:rPr>
           <w:vertAlign w:val="superscript"/>
         </w:rPr>
-        <w:t>25</w:t>
+        <w:t>21</w:t>
       </w:r>
       <w:r>
         <w:t xml:space="preserve"> The resulting relationship and caution codes are retained with the original labels.</w:t>
@@ -573,7 +607,7 @@
         <w:rPr>
           <w:vertAlign w:val="superscript"/>
         </w:rPr>
-        <w:t>26</w:t>
+        <w:t>22</w:t>
       </w:r>
       <w:r>
         <w:t xml:space="preserve"> The release contains 15 UTF-8 comma-separated data tables, documentation, code, and source-material archives. Table 1 lists the principal files and their units. authorizations.csv supplies the submission key, field_annotations.csv holds six records per authorization, and positive_labels.csv records memberships for the first five fields. Clinical-function grouping remains in the authorization and field tables. Evidence references are assigned to fields and accompany their positive-label sets.</w:t>
@@ -749,7 +783,7 @@
         <w:rPr>
           <w:vertAlign w:val="superscript"/>
         </w:rPr>
-        <w:t>27</w:t>
+        <w:t>23</w:t>
       </w:r>
       <w:r>
         <w:t xml:space="preserve"> Reuse should account for annotation scope, field-specific limitations, and shared products or source documents.</w:t>
@@ -799,7 +833,7 @@
         <w:rPr>
           <w:vertAlign w:val="superscript"/>
         </w:rPr>
-        <w:t>28</w:t>
+        <w:t>24</w:t>
       </w:r>
       <w:r>
         <w:t xml:space="preserve"> Related authorizations and shared documents create dependencies; model-development studies should assess leakage across authorizations, product families, manufacturers, and source documents.</w:t>
@@ -808,7 +842,7 @@
         <w:rPr>
           <w:vertAlign w:val="superscript"/>
         </w:rPr>
-        <w:t>29</w:t>
+        <w:t>25</w:t>
       </w:r>
       <w:r>
         <w:t xml:space="preserve"> Record the dataset version, selection rules, and any subsequent source-based corrections, and cite the version used.</w:t>
@@ -817,7 +851,7 @@
         <w:rPr>
           <w:vertAlign w:val="superscript"/>
         </w:rPr>
-        <w:t>30</w:t>
+        <w:t>26</w:t>
       </w:r>
       <w:r/>
     </w:p>
@@ -841,7 +875,7 @@
         <w:rPr>
           <w:vertAlign w:val="superscript"/>
         </w:rPr>
-        <w:t>26</w:t>
+        <w:t>22</w:t>
       </w:r>
       <w:r>
         <w:t xml:space="preserve"> The repository provides individual derived files and downloadable source archives with SHA-256 manifests. Author-created data and documentation are licensed under CC BY 4.0. FDA-hosted source materials retain their original attribution and rights.</w:t>
@@ -867,7 +901,7 @@
         <w:rPr>
           <w:vertAlign w:val="superscript"/>
         </w:rPr>
-        <w:t>31</w:t>
+        <w:t>27</w:t>
       </w:r>
       <w:r/>
     </w:p>
@@ -1042,7 +1076,7 @@
         <w:ind w:left="369" w:hanging="369"/>
       </w:pPr>
       <w:r>
-        <w:t>15. Yim, W.-w. et al. Aci-bench: a Novel Ambient Clinical Intelligence Dataset for Benchmarking Automatic Visit Note Generation. Sci. Data 10, 586 (2023). https://doi.org/10.1038/s41597-023-02487-3</w:t>
+        <w:t>15. Wilkinson, M. D. et al. The FAIR Guiding Principles for scientific data management and stewardship. Sci. Data 3, 160018 (2016). https://doi.org/10.1038/sdata.2016.18</w:t>
       </w:r>
     </w:p>
     <w:p>
@@ -1053,7 +1087,7 @@
         <w:ind w:left="369" w:hanging="369"/>
       </w:pPr>
       <w:r>
-        <w:t>16. Niu, Z. et al. PharmaBench: Enhancing ADMET benchmarks with large language models. Sci. Data 11, 985 (2024). https://doi.org/10.1038/s41597-024-03793-0</w:t>
+        <w:t>16. Gebru, T. et al. Datasheets for Datasets. Commun. ACM 64, 86–92 (2021). https://doi.org/10.1145/3458723</w:t>
       </w:r>
     </w:p>
     <w:p>
@@ -1064,7 +1098,7 @@
         <w:ind w:left="369" w:hanging="369"/>
       </w:pPr>
       <w:r>
-        <w:t>17. Xiong, Y. et al. PCMR: a comprehensive precancerous molecular resource. Sci. Data 12, 551 (2025). https://doi.org/10.1038/s41597-025-04899-9</w:t>
+        <w:t>17. Bender, E. M. &amp; Friedman, B. Data Statements for Natural Language Processing: Toward Mitigating System Bias and Enabling Better Science. Trans. Assoc. Comput. Linguist. 6, 587–604 (2018). https://doi.org/10.1162/tacl_a_00041</w:t>
       </w:r>
     </w:p>
     <w:p>
@@ -1075,7 +1109,7 @@
         <w:ind w:left="369" w:hanging="369"/>
       </w:pPr>
       <w:r>
-        <w:t>18. Wilkinson, M. D. et al. The FAIR Guiding Principles for scientific data management and stewardship. Sci. Data 3, 160018 (2016). https://doi.org/10.1038/sdata.2016.18</w:t>
+        <w:t>18. US Food and Drug Administration. Multiple Function Device Products: Policy and Considerations. https://www.fda.gov/regulatory-information/search-fda-guidance-documents/multiple-function-device-products-policy-and-considerations (2020).</w:t>
       </w:r>
     </w:p>
     <w:p>
@@ -1086,7 +1120,7 @@
         <w:ind w:left="369" w:hanging="369"/>
       </w:pPr>
       <w:r>
-        <w:t>19. Sansone, S.-A. et al. FAIRsharing as a community approach to standards, repositories and policies. Nat. Biotechnol. 37, 358–367 (2019). https://doi.org/10.1038/s41587-019-0080-8</w:t>
+        <w:t>19. Moreau, L. &amp; Missier, P. (eds.) PROV-DM: The PROV Data Model. W3C Recommendation (2013). https://www.w3.org/TR/2013/REC-prov-dm-20130430/</w:t>
       </w:r>
     </w:p>
     <w:p>
@@ -1097,7 +1131,7 @@
         <w:ind w:left="369" w:hanging="369"/>
       </w:pPr>
       <w:r>
-        <w:t>20. Gebru, T. et al. Datasheets for Datasets. Commun. ACM 64, 86–92 (2021). https://doi.org/10.1145/3458723</w:t>
+        <w:t>20. Sandve, G. K., Nekrutenko, A., Taylor, J. &amp; Hovig, E. Ten simple rules for reproducible computational research. PLoS Comput. Biol. 9, e1003285 (2013). https://doi.org/10.1371/journal.pcbi.1003285</w:t>
       </w:r>
     </w:p>
     <w:p>
@@ -1108,7 +1142,7 @@
         <w:ind w:left="369" w:hanging="369"/>
       </w:pPr>
       <w:r>
-        <w:t>21. Bender, E. M. &amp; Friedman, B. Data Statements for Natural Language Processing: Toward Mitigating System Bias and Enabling Better Science. Trans. Assoc. Comput. Linguist. 6, 587–604 (2018). https://doi.org/10.1162/tacl_a_00041</w:t>
+        <w:t>21. Muehlematter, U. J., Bluethgen, C. &amp; Vokinger, K. N. FDA-cleared artificial intelligence and machine learning-based medical devices and their 510(k) predicate networks. Lancet Digit. Health 5, e618–e626 (2023). https://doi.org/10.1016/S2589-7500(23)00126-7</w:t>
       </w:r>
     </w:p>
     <w:p>
@@ -1119,7 +1153,7 @@
         <w:ind w:left="369" w:hanging="369"/>
       </w:pPr>
       <w:r>
-        <w:t>22. US Food and Drug Administration. Multiple Function Device Products: Policy and Considerations. https://www.fda.gov/regulatory-information/search-fda-guidance-documents/multiple-function-device-products-policy-and-considerations (2020).</w:t>
+        <w:t>22. Wang, G. et al. Clinical-function annotations for 1524 US artificial intelligence medical-device authorizations (v1.3.0). GitHub https://github.com/wang177777/fda-ai-clinical-function-annotations/releases/tag/v1.3.0 (2026).</w:t>
       </w:r>
     </w:p>
     <w:p>
@@ -1130,7 +1164,7 @@
         <w:ind w:left="369" w:hanging="369"/>
       </w:pPr>
       <w:r>
-        <w:t>23. Moreau, L. &amp; Missier, P. (eds.) PROV-DM: The PROV Data Model. W3C Recommendation (2013). https://www.w3.org/TR/2013/REC-prov-dm-20130430/</w:t>
+        <w:t>23. Artstein, R. &amp; Poesio, M. Inter-Coder Agreement for Computational Linguistics. Comput. Linguist. 34, 555–596 (2008). https://doi.org/10.1162/coli.07-034-R2</w:t>
       </w:r>
     </w:p>
     <w:p>
@@ -1141,7 +1175,7 @@
         <w:ind w:left="369" w:hanging="369"/>
       </w:pPr>
       <w:r>
-        <w:t>24. Sandve, G. K., Nekrutenko, A., Taylor, J. &amp; Hovig, E. Ten simple rules for reproducible computational research. PLoS Comput. Biol. 9, e1003285 (2013). https://doi.org/10.1371/journal.pcbi.1003285</w:t>
+        <w:t>24. Diab, A. R. &amp; Lotter, W. Distinguishing between Rigor and Transparency in FDA Marketing Authorization of AI-enabled Medical Devices. Radiol. Artif. Intell. 7, e250369 (2025). https://doi.org/10.1148/ryai.250369</w:t>
       </w:r>
     </w:p>
     <w:p>
@@ -1152,7 +1186,7 @@
         <w:ind w:left="369" w:hanging="369"/>
       </w:pPr>
       <w:r>
-        <w:t>25. Muehlematter, U. J., Bluethgen, C. &amp; Vokinger, K. N. FDA-cleared artificial intelligence and machine learning-based medical devices and their 510(k) predicate networks. Lancet Digit. Health 5, e618–e626 (2023). https://doi.org/10.1016/S2589-7500(23)00126-7</w:t>
+        <w:t>25. Kapoor, S. &amp; Narayanan, A. Leakage and the reproducibility crisis in machine-learning-based science. Patterns 4, 100804 (2023). https://doi.org/10.1016/j.patter.2023.100804</w:t>
       </w:r>
     </w:p>
     <w:p>
@@ -1163,7 +1197,7 @@
         <w:ind w:left="369" w:hanging="369"/>
       </w:pPr>
       <w:r>
-        <w:t>26. Wang, G. et al. Clinical-function annotations for 1524 US artificial intelligence medical-device authorizations (v1.3.0). GitHub https://github.com/wang177777/fda-ai-clinical-function-annotations/releases/tag/v1.3.0 (2026).</w:t>
+        <w:t>26. Cousijn, H. et al. A data citation roadmap for scientific publishers. Sci. Data 5, 180259 (2018). https://doi.org/10.1038/sdata.2018.259</w:t>
       </w:r>
     </w:p>
     <w:p>
@@ -1174,7 +1208,7 @@
         <w:ind w:left="369" w:hanging="369"/>
       </w:pPr>
       <w:r>
-        <w:t>27. Artstein, R. &amp; Poesio, M. Inter-Coder Agreement for Computational Linguistics. Comput. Linguist. 34, 555–596 (2008). https://doi.org/10.1162/coli.07-034-R2</w:t>
+        <w:t>27. Wilson, G. et al. Good enough practices in scientific computing. PLoS Comput. Biol. 13, e1005510 (2017). https://doi.org/10.1371/journal.pcbi.1005510</w:t>
       </w:r>
     </w:p>
     <w:p>
@@ -1185,7 +1219,7 @@
         <w:ind w:left="369" w:hanging="369"/>
       </w:pPr>
       <w:r>
-        <w:t>28. Diab, A. R. &amp; Lotter, W. Distinguishing between Rigor and Transparency in FDA Marketing Authorization of AI-enabled Medical Devices. Radiol. Artif. Intell. 7, e250369 (2025). https://doi.org/10.1148/ryai.250369</w:t>
+        <w:t>28. LabStyle Innovation Ltd. 510(k) Summary [Dario Blood Glucose Monitoring System; K150817]. https://www.accessdata.fda.gov/cdrh_docs/pdf15/K150817.pdf (2015).</w:t>
       </w:r>
     </w:p>
     <w:p>
@@ -1196,7 +1230,7 @@
         <w:ind w:left="369" w:hanging="369"/>
       </w:pPr>
       <w:r>
-        <w:t>29. Kapoor, S. &amp; Narayanan, A. Leakage and the reproducibility crisis in machine-learning-based science. Patterns 4, 100804 (2023). https://doi.org/10.1016/j.patter.2023.100804</w:t>
+        <w:t>29. Arterys Inc. Section 5. 510(k) Summary [Arterys MICA; K182034]. https://www.accessdata.fda.gov/cdrh_docs/pdf18/K182034.pdf (2018).</w:t>
       </w:r>
     </w:p>
     <w:p>
@@ -1207,7 +1241,7 @@
         <w:ind w:left="369" w:hanging="369"/>
       </w:pPr>
       <w:r>
-        <w:t>30. Cousijn, H. et al. A data citation roadmap for scientific publishers. Sci. Data 5, 180259 (2018). https://doi.org/10.1038/sdata.2018.259</w:t>
+        <w:t>30. WellDoc, Inc. K190013 510(k) Summary [WellDoc BlueStar]. https://www.accessdata.fda.gov/cdrh_docs/pdf19/K190013.pdf (2019).</w:t>
       </w:r>
     </w:p>
     <w:p>
@@ -1218,51 +1252,7 @@
         <w:ind w:left="369" w:hanging="369"/>
       </w:pPr>
       <w:r>
-        <w:t>31. Wilson, G. et al. Good enough practices in scientific computing. PLoS Comput. Biol. 13, e1005510 (2017). https://doi.org/10.1371/journal.pcbi.1005510</w:t>
-      </w:r>
-    </w:p>
-    <w:p>
-      <w:pPr>
-        <w:keepLines/>
-        <w:widowControl/>
-        <w:spacing w:line="288" w:lineRule="auto" w:after="100"/>
-        <w:ind w:left="369" w:hanging="369"/>
-      </w:pPr>
-      <w:r>
-        <w:t>32. LabStyle Innovation Ltd. 510(k) Summary [Dario Blood Glucose Monitoring System; K150817]. https://www.accessdata.fda.gov/cdrh_docs/pdf15/K150817.pdf (2015).</w:t>
-      </w:r>
-    </w:p>
-    <w:p>
-      <w:pPr>
-        <w:keepLines/>
-        <w:widowControl/>
-        <w:spacing w:line="288" w:lineRule="auto" w:after="100"/>
-        <w:ind w:left="369" w:hanging="369"/>
-      </w:pPr>
-      <w:r>
-        <w:t>33. Arterys Inc. Section 5. 510(k) Summary [Arterys MICA; K182034]. https://www.accessdata.fda.gov/cdrh_docs/pdf18/K182034.pdf (2018).</w:t>
-      </w:r>
-    </w:p>
-    <w:p>
-      <w:pPr>
-        <w:keepLines/>
-        <w:widowControl/>
-        <w:spacing w:line="288" w:lineRule="auto" w:after="100"/>
-        <w:ind w:left="369" w:hanging="369"/>
-      </w:pPr>
-      <w:r>
-        <w:t>34. WellDoc, Inc. K190013 510(k) Summary [WellDoc BlueStar]. https://www.accessdata.fda.gov/cdrh_docs/pdf19/K190013.pdf (2019).</w:t>
-      </w:r>
-    </w:p>
-    <w:p>
-      <w:pPr>
-        <w:keepLines/>
-        <w:widowControl/>
-        <w:spacing w:line="288" w:lineRule="auto" w:after="100"/>
-        <w:ind w:left="369" w:hanging="369"/>
-      </w:pPr>
-      <w:r>
-        <w:t>35. US Food and Drug Administration. 510(k) Substantial Equivalence Determination Decision Summary [K182513: FluChip-8G Influenza A+B Assay]. https://www.accessdata.fda.gov/cdrh_docs/reviews/K182513.pdf (2019).</w:t>
+        <w:t>31. US Food and Drug Administration. 510(k) Substantial Equivalence Determination Decision Summary [K182513: FluChip-8G Influenza A+B Assay]. https://www.accessdata.fda.gov/cdrh_docs/reviews/K182513.pdf (2019).</w:t>
       </w:r>
     </w:p>
     <w:p>
@@ -3424,7 +3414,7 @@
         <w:rPr>
           <w:vertAlign w:val="superscript"/>
         </w:rPr>
-        <w:t>32</w:t>
+        <w:t>28</w:t>
       </w:r>
       <w:r>
         <w:t xml:space="preserve"> Arterys MICA 510(k) summary,</w:t>
@@ -3433,7 +3423,7 @@
         <w:rPr>
           <w:vertAlign w:val="superscript"/>
         </w:rPr>
-        <w:t>33</w:t>
+        <w:t>29</w:t>
       </w:r>
       <w:r>
         <w:t xml:space="preserve"> BlueStar 510(k) summary,</w:t>
@@ -3442,7 +3432,7 @@
         <w:rPr>
           <w:vertAlign w:val="superscript"/>
         </w:rPr>
-        <w:t>34</w:t>
+        <w:t>30</w:t>
       </w:r>
       <w:r>
         <w:t xml:space="preserve"> and FluChip-8G FDA decision summary.</w:t>
@@ -3451,7 +3441,7 @@
         <w:rPr>
           <w:vertAlign w:val="superscript"/>
         </w:rPr>
-        <w:t>35</w:t>
+        <w:t>31</w:t>
       </w:r>
       <w:r>
         <w:t xml:space="preserve"> Page numbers count physical PDF pages from one.</w:t>

</xml_diff>

<commit_message>
Refine manuscript claims and audit all citation placements
</commit_message>
<xml_diff>
--- a/manuscript/Data_Descriptor.docx
+++ b/manuscript/Data_Descriptor.docx
@@ -230,13 +230,22 @@
         <w:t>2</w:t>
       </w:r>
       <w:r>
-        <w:t xml:space="preserve"> Subsequent studies characterized clinical tasks, inputs, and outputs.</w:t>
+        <w:t xml:space="preserve"> Lyell et al. characterized clinical tasks, device inputs, and outputs.</w:t>
       </w:r>
       <w:r>
         <w:rPr>
           <w:vertAlign w:val="superscript"/>
         </w:rPr>
-        <w:t>3,4</w:t>
+        <w:t>3</w:t>
+      </w:r>
+      <w:r>
+        <w:t xml:space="preserve"> Singh et al. classified clinical functions, AI functions, and input data types across 1016 authorizations.</w:t>
+      </w:r>
+      <w:r>
+        <w:rPr>
+          <w:vertAlign w:val="superscript"/>
+        </w:rPr>
+        <w:t>4</w:t>
       </w:r>
       <w:r>
         <w:t xml:space="preserve"> Imaging-focused work examined intended use and clinician-facing interfaces.</w:t>
@@ -263,7 +272,7 @@
         <w:t>6</w:t>
       </w:r>
       <w:r>
-        <w:t xml:space="preserve"> Public regulatory documents also vary in their reporting of device evaluation and other attributes.</w:t>
+        <w:t xml:space="preserve"> Public regulatory documents also vary in their reporting of device evaluation and population characteristics.</w:t>
       </w:r>
       <w:r>
         <w:rPr>
@@ -272,7 +281,7 @@
         <w:t>7</w:t>
       </w:r>
       <w:r>
-        <w:t xml:space="preserve"> Recent analyses of regulatory databases identify searchable descriptions, structured metadata, and links between device versions as priorities.</w:t>
+        <w:t xml:space="preserve"> A recent perspective on regulatory databases identifies searchable descriptions, structured metadata, and links between device versions as priorities.</w:t>
       </w:r>
       <w:r>
         <w:rPr>
@@ -305,7 +314,7 @@
         <w:t>10</w:t>
       </w:r>
       <w:r>
-        <w:t xml:space="preserve"> DECIDE-AI emphasizes workflow and human interaction during early clinical evaluation.</w:t>
+        <w:t xml:space="preserve"> DECIDE-AI emphasizes workflow and human interaction during early, live clinical evaluation.</w:t>
       </w:r>
       <w:r>
         <w:rPr>
@@ -338,7 +347,7 @@
         <w:t>13</w:t>
       </w:r>
       <w:r>
-        <w:t xml:space="preserve"> SPIRIT-CONSORT-TM links clinical-trial annotations to text at multiple levels.</w:t>
+        <w:t xml:space="preserve"> SPIRIT-CONSORT-TM annotates reporting items in clinical-trial protocols and results publications at article, sentence, and term levels.</w:t>
       </w:r>
       <w:r>
         <w:rPr>
@@ -405,13 +414,22 @@
         <w:t>1</w:t>
       </w:r>
       <w:r>
-        <w:t xml:space="preserve"> The retained authorization decision dates range from September 29, 1995, to March 30, 2026. Source retrieval records are dated June 30, 2026. The historical CSV and XLSX snapshots, access metadata, SHA-256 fingerprints, and original record positions are included in the release. Submission number is the linkage key, and device name and company are descriptive attributes. Multiple authorizations for a product family remain separate records. The observation unit is therefore an authorization, with products, internal models, and clinical deployments represented only insofar as they are described in the source material. Explicit documentation of the observation unit, cohort selection, and annotation context supports the interpretation of derived datasets and text corpora.</w:t>
+        <w:t xml:space="preserve"> The retained authorization decision dates range from September 29, 1995, to March 30, 2026. Source retrieval records are dated June 30, 2026. The historical CSV and XLSX snapshots, access metadata, SHA-256 fingerprints, and original record positions are included in the release. Submission number is the linkage key, and device name and company are descriptive attributes. Multiple authorizations for a product family remain separate records. The observation unit is therefore an authorization, with products, internal models, and clinical deployments represented only insofar as they are described in the source material. Dataset documentation should specify the observation unit and collection procedures.</w:t>
       </w:r>
       <w:r>
         <w:rPr>
           <w:vertAlign w:val="superscript"/>
         </w:rPr>
-        <w:t>16,17</w:t>
+        <w:t>16</w:t>
+      </w:r>
+      <w:r>
+        <w:t xml:space="preserve"> For text-derived resources, corpus selection and annotation context help users interpret the scope of the annotations.</w:t>
+      </w:r>
+      <w:r>
+        <w:rPr>
+          <w:vertAlign w:val="superscript"/>
+        </w:rPr>
+        <w:t>17</w:t>
       </w:r>
       <w:r/>
     </w:p>
@@ -476,7 +494,7 @@
         <w:widowControl/>
       </w:pPr>
       <w:r>
-        <w:t>For authorizations with multiple functions, the first five fields contain the union of the supported labels. Indications for Use statements and other eligible passages contribute to the same six fields. Input–output–action membership is represented at the authorization level. Table 3 illustrates selected applications of the attribution, output-category, and grouping rules.</w:t>
+        <w:t>For authorizations with multiple functions, the first five fields contain the union of the supported labels. Indications for Use statements and other eligible passages contribute to the same six fields. Input–output–action membership is represented at the authorization level.</w:t>
       </w:r>
     </w:p>
     <w:p>
@@ -550,7 +568,7 @@
         <w:widowControl/>
       </w:pPr>
       <w:r>
-        <w:t>Evidence records link annotation identifiers to source-record identifiers and preserve the recorded public URL. URL-token checks identify references to the subject authorization, alternate identifiers, or another authorization. Cross-authorization references receive a separate source-association review because an earlier authorization can describe an inherited or integrated function. Published analyses of 510(k) predicate networks show why links between authorizations require examination of the functions described in each submission.</w:t>
+        <w:t>Evidence records link annotation identifiers to source-record identifiers and preserve the recorded public URL. URL-token checks identify references to the subject authorization, alternate identifiers, or another authorization. Cross-authorization references receive a separate source-association review because an earlier authorization can describe an inherited or integrated function. An analysis of 510(k) predicate networks found that AI and machine-learning tasks can change along predicate chains.</w:t>
       </w:r>
       <w:r>
         <w:rPr>
@@ -559,7 +577,7 @@
         <w:t>21</w:t>
       </w:r>
       <w:r>
-        <w:t xml:space="preserve"> The resulting relationship and caution codes are retained with the original labels.</w:t>
+        <w:t xml:space="preserve"> The source-association review records relationship and caution codes alongside the original labels.</w:t>
       </w:r>
     </w:p>
     <w:p>
@@ -769,7 +787,7 @@
         <w:widowControl/>
       </w:pPr>
       <w:r>
-        <w:t>The checks assess cohort identity, table consistency, evidence location, and the recorded relationships between source authorizations. All 3109 retained capture files matched their recorded hashes: 1584 PDF files, 1524 HTML files, and one non-PDF failure response. The capture manifest also identifies 16 failed retrievals with no retained document file. Three review-reference PDFs downloaded during release preparation accompany this retained capture set. Expert confirmation covered the supplied annotation draft and the two targeted coding decisions for K182034 and K190013.</w:t>
+        <w:t>The checks assess cohort identity, table consistency, evidence location, and the recorded relationships between source authorizations. All 3109 retained capture files matched their recorded hashes: 1584 PDF files, 1524 HTML files, and one non-PDF failure response. The capture manifest also identifies 16 failed retrievals with no retained document file. Three review-reference PDFs downloaded during release preparation accompany this retained capture set. Expert confirmation covered the supplied annotation draft and the two targeted coding decisions for K182034 and K190013. Table 3 illustrates selected applications of the attribution, output-category, and grouping rules.</w:t>
       </w:r>
     </w:p>
     <w:p>
@@ -836,7 +854,7 @@
         <w:t>24</w:t>
       </w:r>
       <w:r>
-        <w:t xml:space="preserve"> Related authorizations and shared documents create dependencies; model-development studies should assess leakage across authorizations, product families, manufacturers, and source documents.</w:t>
+        <w:t xml:space="preserve"> Non-independent training and test observations can introduce data leakage.</w:t>
       </w:r>
       <w:r>
         <w:rPr>
@@ -845,7 +863,7 @@
         <w:t>25</w:t>
       </w:r>
       <w:r>
-        <w:t xml:space="preserve"> Record the dataset version, selection rules, and any subsequent source-based corrections, and cite the version used.</w:t>
+        <w:t xml:space="preserve"> For this resource, model-development studies should examine dependencies among related authorizations, product families, manufacturers, and source documents. Document selection rules and any subsequent source-based corrections. Cite the dataset version used.</w:t>
       </w:r>
       <w:r>
         <w:rPr>
@@ -895,7 +913,7 @@
         <w:widowControl/>
       </w:pPr>
       <w:r>
-        <w:t>The assembly, validation, source-download, and retrieval scripts are available at https://github.com/wang177777/fda-ai-clinical-function-annotations/tree/v1.3.0/scripts under the MIT license. Data reconstruction and validation use Python 3.10 or later and the standard library. The repository documents how to download the source archives, reproduce the derived tables, and repeat the evidence-location checks. Figure-generation code and its rendering dependencies are provided in figure_generation/. The repository brings the code, data documentation, license information, and validation commands together using practices described for reusable scientific computing.</w:t>
+        <w:t>The assembly, validation, source-download, and retrieval scripts are available at https://github.com/wang177777/fda-ai-clinical-function-annotations/tree/v1.3.0/scripts under the MIT license. Data reconstruction and validation use Python 3.10 or later and the standard library. The repository documents how to download the source archives, reproduce the derived tables, and repeat the evidence-location checks. Figure-generation code and its rendering dependencies are provided in figure_generation/. The README, citation metadata, and license files provide documentation and attribution information recommended for reusable scientific computing.</w:t>
       </w:r>
       <w:r>
         <w:rPr>
@@ -3051,7 +3069,7 @@
                 <w:b/>
                 <w:sz w:val="20"/>
               </w:rPr>
-              <w:t>FDA source; physical pages</w:t>
+              <w:t>FDA-hosted source; physical pages</w:t>
             </w:r>
           </w:p>
         </w:tc>
@@ -3127,10 +3145,24 @@
             <w:r>
               <w:rPr>
                 <w:rFonts w:ascii="Times New Roman" w:hAnsi="Times New Roman"/>
-                <w:b w:val="0"/>
                 <w:sz w:val="20"/>
               </w:rPr>
-              <w:t>K150817.pdf; 5–6</w:t>
+              <w:t>K150817.pdf</w:t>
+            </w:r>
+            <w:r>
+              <w:rPr>
+                <w:rFonts w:ascii="Times New Roman" w:hAnsi="Times New Roman"/>
+                <w:sz w:val="20"/>
+                <w:vertAlign w:val="superscript"/>
+              </w:rPr>
+              <w:t>28</w:t>
+            </w:r>
+            <w:r>
+              <w:rPr>
+                <w:rFonts w:ascii="Times New Roman" w:hAnsi="Times New Roman"/>
+                <w:sz w:val="20"/>
+              </w:rPr>
+              <w:t>; 5–6</w:t>
             </w:r>
           </w:p>
         </w:tc>
@@ -3166,7 +3198,7 @@
                 <w:b w:val="0"/>
                 <w:sz w:val="20"/>
               </w:rPr>
-              <w:t>The reviewed whole-device description leaves AI attribution unresolved.</w:t>
+              <w:t>The source describes glucose measurement using an internal algorithm. AI attribution remains unresolved under the study rules.</w:t>
             </w:r>
           </w:p>
         </w:tc>
@@ -3204,10 +3236,24 @@
             <w:r>
               <w:rPr>
                 <w:rFonts w:ascii="Times New Roman" w:hAnsi="Times New Roman"/>
-                <w:b w:val="0"/>
                 <w:sz w:val="20"/>
               </w:rPr>
-              <w:t>K182034.pdf; 5–7</w:t>
+              <w:t>K182034.pdf</w:t>
+            </w:r>
+            <w:r>
+              <w:rPr>
+                <w:rFonts w:ascii="Times New Roman" w:hAnsi="Times New Roman"/>
+                <w:sz w:val="20"/>
+                <w:vertAlign w:val="superscript"/>
+              </w:rPr>
+              <w:t>29</w:t>
+            </w:r>
+            <w:r>
+              <w:rPr>
+                <w:rFonts w:ascii="Times New Roman" w:hAnsi="Times New Roman"/>
+                <w:sz w:val="20"/>
+              </w:rPr>
+              <w:t>; 5–7</w:t>
             </w:r>
           </w:p>
         </w:tc>
@@ -3281,10 +3327,24 @@
             <w:r>
               <w:rPr>
                 <w:rFonts w:ascii="Times New Roman" w:hAnsi="Times New Roman"/>
-                <w:b w:val="0"/>
                 <w:sz w:val="20"/>
               </w:rPr>
-              <w:t>K190013.pdf; 4, 6, 10</w:t>
+              <w:t>K190013.pdf</w:t>
+            </w:r>
+            <w:r>
+              <w:rPr>
+                <w:rFonts w:ascii="Times New Roman" w:hAnsi="Times New Roman"/>
+                <w:sz w:val="20"/>
+                <w:vertAlign w:val="superscript"/>
+              </w:rPr>
+              <w:t>30</w:t>
+            </w:r>
+            <w:r>
+              <w:rPr>
+                <w:rFonts w:ascii="Times New Roman" w:hAnsi="Times New Roman"/>
+                <w:sz w:val="20"/>
+              </w:rPr>
+              <w:t>; 4, 6, 10</w:t>
             </w:r>
           </w:p>
         </w:tc>
@@ -3358,10 +3418,24 @@
             <w:r>
               <w:rPr>
                 <w:rFonts w:ascii="Times New Roman" w:hAnsi="Times New Roman"/>
-                <w:b w:val="0"/>
                 <w:sz w:val="20"/>
               </w:rPr>
-              <w:t>reviews/K182513.pdf; 8–9</w:t>
+              <w:t>reviews/K182513.pdf</w:t>
+            </w:r>
+            <w:r>
+              <w:rPr>
+                <w:rFonts w:ascii="Times New Roman" w:hAnsi="Times New Roman"/>
+                <w:sz w:val="20"/>
+                <w:vertAlign w:val="superscript"/>
+              </w:rPr>
+              <w:t>31</w:t>
+            </w:r>
+            <w:r>
+              <w:rPr>
+                <w:rFonts w:ascii="Times New Roman" w:hAnsi="Times New Roman"/>
+                <w:sz w:val="20"/>
+              </w:rPr>
+              <w:t>; 8–9</w:t>
             </w:r>
           </w:p>
         </w:tc>
@@ -3408,43 +3482,7 @@
         <w:widowControl/>
       </w:pPr>
       <w:r>
-        <w:t>The examples illustrate attribution, output-category, and function-grouping decisions in the versioned release. Sources, in row order: the Dario 510(k) summary,</w:t>
-      </w:r>
-      <w:r>
-        <w:rPr>
-          <w:vertAlign w:val="superscript"/>
-        </w:rPr>
-        <w:t>28</w:t>
-      </w:r>
-      <w:r>
-        <w:t xml:space="preserve"> Arterys MICA 510(k) summary,</w:t>
-      </w:r>
-      <w:r>
-        <w:rPr>
-          <w:vertAlign w:val="superscript"/>
-        </w:rPr>
-        <w:t>29</w:t>
-      </w:r>
-      <w:r>
-        <w:t xml:space="preserve"> BlueStar 510(k) summary,</w:t>
-      </w:r>
-      <w:r>
-        <w:rPr>
-          <w:vertAlign w:val="superscript"/>
-        </w:rPr>
-        <w:t>30</w:t>
-      </w:r>
-      <w:r>
-        <w:t xml:space="preserve"> and FluChip-8G FDA decision summary.</w:t>
-      </w:r>
-      <w:r>
-        <w:rPr>
-          <w:vertAlign w:val="superscript"/>
-        </w:rPr>
-        <w:t>31</w:t>
-      </w:r>
-      <w:r>
-        <w:t xml:space="preserve"> Page numbers count physical PDF pages from one.</w:t>
+        <w:t>Retained coding applies the study definitions to the cited source descriptions. The examples illustrate attribution, output-category, and function-grouping decisions in the versioned release. Page numbers count physical PDF pages from one.</w:t>
       </w:r>
     </w:p>
     <w:p>

</xml_diff>